<commit_message>
Merged remote changes with local project setup
</commit_message>
<xml_diff>
--- a/data/word_templates/script 10 (1).docx
+++ b/data/word_templates/script 10 (1).docx
@@ -85,308 +85,7 @@
       </w:r>
     </w:p>
     <w:p>
-      <w:r>
-        <w:t xml:space="preserve">Your account has now been forwarded to the </w:t>
-      </w:r>
-      <w:r>
-        <w:rPr>
-          <w:b/>
-          <w:bCs/>
-        </w:rPr>
-        <w:t>Office of Debt Litigation &amp; Arbitration</w:t>
-      </w:r>
-      <w:r>
-        <w:t xml:space="preserve">, and </w:t>
-      </w:r>
-      <w:r>
-        <w:rPr>
-          <w:b/>
-          <w:bCs/>
-        </w:rPr>
-        <w:t>your file has been tagged for immediate court action</w:t>
-      </w:r>
-      <w:r>
-        <w:t>. You are being held liable under the following legal statutes:</w:t>
-      </w:r>
-    </w:p>
-    <w:p>
-      <w:pPr>
-        <w:numPr>
-          <w:ilvl w:val="0"/>
-          <w:numId w:val="1"/>
-        </w:numPr>
-      </w:pPr>
-      <w:r>
-        <w:rPr>
-          <w:b/>
-          <w:bCs/>
-        </w:rPr>
-        <w:t>Breach of Loan Agreement (U.S. Code 15 § 1</w:t>
-      </w:r>
-      <w:r>
-        <w:rPr>
-          <w:b/>
-          <w:bCs/>
-        </w:rPr>
-        <w:t>5</w:t>
-      </w:r>
-      <w:r>
-        <w:rPr>
-          <w:b/>
-          <w:bCs/>
-        </w:rPr>
-        <w:t>92)</w:t>
-      </w:r>
-    </w:p>
-    <w:p>
-      <w:pPr>
-        <w:numPr>
-          <w:ilvl w:val="0"/>
-          <w:numId w:val="1"/>
-        </w:numPr>
-      </w:pPr>
-      <w:r>
-        <w:rPr>
-          <w:b/>
-          <w:bCs/>
-        </w:rPr>
-        <w:t>Intentional Check Fraud</w:t>
-      </w:r>
-    </w:p>
-    <w:p>
-      <w:pPr>
-        <w:numPr>
-          <w:ilvl w:val="0"/>
-          <w:numId w:val="1"/>
-        </w:numPr>
-      </w:pPr>
-      <w:r>
-        <w:rPr>
-          <w:b/>
-          <w:bCs/>
-        </w:rPr>
-        <w:t>Misrepresentation and Deceptive Conduct</w:t>
-      </w:r>
-    </w:p>
-    <w:p>
-      <w:pPr>
-        <w:numPr>
-          <w:ilvl w:val="0"/>
-          <w:numId w:val="1"/>
-        </w:numPr>
-      </w:pPr>
-      <w:r>
-        <w:rPr>
-          <w:b/>
-          <w:bCs/>
-        </w:rPr>
-        <w:t>Deliberate Default and Negligent Liability</w:t>
-      </w:r>
-    </w:p>
-    <w:p>
-      <w:pPr>
-        <w:rPr>
-          <w:b/>
-          <w:bCs/>
-        </w:rPr>
-      </w:pPr>
-      <w:r>
-        <w:rPr>
-          <w:b/>
-          <w:bCs/>
-        </w:rPr>
-        <w:t>Settlement Opportunity (Deadline: 72 Hours from Receipt of Notice):</w:t>
-      </w:r>
-    </w:p>
-    <w:p>
-      <w:pPr>
-        <w:rPr>
-          <w:b/>
-          <w:bCs/>
-        </w:rPr>
-      </w:pPr>
-    </w:p>
-    <w:p>
-      <w:pPr>
-        <w:pStyle w:val="ListParagraph"/>
-        <w:numPr>
-          <w:ilvl w:val="0"/>
-          <w:numId w:val="4"/>
-        </w:numPr>
-      </w:pPr>
-      <w:r>
-        <w:rPr>
-          <w:b/>
-          <w:bCs/>
-        </w:rPr>
-        <w:t>Option 1-</w:t>
-      </w:r>
-      <w:r>
-        <w:rPr>
-          <w:b/>
-          <w:bCs/>
-        </w:rPr>
-        <w:t xml:space="preserve"> </w:t>
-      </w:r>
-      <w:r>
-        <w:t>We</w:t>
-      </w:r>
-      <w:r>
-        <w:t xml:space="preserve"> are offering you a one-time chance to </w:t>
-      </w:r>
-      <w:r>
-        <w:rPr>
-          <w:b/>
-          <w:bCs/>
-        </w:rPr>
-        <w:t xml:space="preserve">settle your outstanding account for </w:t>
-      </w:r>
-      <w:r>
-        <w:rPr>
-          <w:b/>
-          <w:bCs/>
-        </w:rPr>
-        <w:t>USD</w:t>
-      </w:r>
-      <w:r>
-        <w:rPr>
-          <w:b/>
-          <w:bCs/>
-        </w:rPr>
-        <w:t>1299.75</w:t>
-      </w:r>
-      <w:r>
-        <w:t xml:space="preserve">, which will prevent further legal escalation and immediate filing with the </w:t>
-      </w:r>
-      <w:r>
-        <w:rPr>
-          <w:b/>
-          <w:bCs/>
-        </w:rPr>
-        <w:t>Superior Civil Court</w:t>
-      </w:r>
-      <w:r>
-        <w:t>.</w:t>
-      </w:r>
-    </w:p>
-    <w:p>
-      <w:pPr>
-        <w:pStyle w:val="ListParagraph"/>
-        <w:numPr>
-          <w:ilvl w:val="0"/>
-          <w:numId w:val="4"/>
-        </w:numPr>
-      </w:pPr>
-      <w:r>
-        <w:rPr>
-          <w:b/>
-          <w:bCs/>
-        </w:rPr>
-        <w:t>Option 2</w:t>
-      </w:r>
-      <w:r>
-        <w:rPr>
-          <w:b/>
-          <w:bCs/>
-        </w:rPr>
-        <w:t>-</w:t>
-      </w:r>
-      <w:r>
-        <w:rPr>
-          <w:b/>
-          <w:bCs/>
-        </w:rPr>
-        <w:t xml:space="preserve"> Installment Resolution Plan:</w:t>
-      </w:r>
-      <w:r>
-        <w:br/>
-        <w:t xml:space="preserve">Pay </w:t>
-      </w:r>
-      <w:r>
-        <w:rPr>
-          <w:b/>
-          <w:bCs/>
-        </w:rPr>
-        <w:t>USD</w:t>
-      </w:r>
-      <w:r>
-        <w:rPr>
-          <w:b/>
-          <w:bCs/>
-        </w:rPr>
-        <w:t>3</w:t>
-      </w:r>
-      <w:r>
-        <w:rPr>
-          <w:b/>
-          <w:bCs/>
-        </w:rPr>
-        <w:t>0</w:t>
-      </w:r>
-      <w:r>
-        <w:rPr>
-          <w:b/>
-          <w:bCs/>
-        </w:rPr>
-        <w:t>0.00 today</w:t>
-      </w:r>
-      <w:r>
-        <w:t xml:space="preserve"> as a goodwill token. The remaining balance is to be paid for </w:t>
-      </w:r>
-      <w:r>
-        <w:rPr>
-          <w:b/>
-          <w:bCs/>
-        </w:rPr>
-        <w:t>USD</w:t>
-      </w:r>
-      <w:r>
-        <w:rPr>
-          <w:b/>
-          <w:bCs/>
-        </w:rPr>
-        <w:t>3</w:t>
-      </w:r>
-      <w:r>
-        <w:rPr>
-          <w:b/>
-          <w:bCs/>
-        </w:rPr>
-        <w:t>0</w:t>
-      </w:r>
-      <w:r>
-        <w:rPr>
-          <w:b/>
-          <w:bCs/>
-        </w:rPr>
-        <w:t>0.00 weekly installments</w:t>
-      </w:r>
-      <w:r>
-        <w:t xml:space="preserve"> until the full debt is cleared. This will </w:t>
-      </w:r>
-      <w:r>
-        <w:rPr>
-          <w:b/>
-          <w:bCs/>
-        </w:rPr>
-        <w:t>temporarily pause</w:t>
-      </w:r>
-      <w:r>
-        <w:t xml:space="preserve"> legal action for 14 days.</w:t>
-      </w:r>
-    </w:p>
-    <w:p/>
-    <w:p>
-      <w:r>
-        <w:t>To activate the settlement:</w:t>
-      </w:r>
-    </w:p>
-    <w:p>
-      <w:pPr>
-        <w:numPr>
-          <w:ilvl w:val="0"/>
-          <w:numId w:val="2"/>
-        </w:numPr>
+      <w:pPr>
         <w:rPr>
           <w:b/>
           <w:bCs/>
@@ -412,29 +111,331 @@
       </w:hyperlink>
     </w:p>
     <w:p>
+      <w:r>
+        <w:t xml:space="preserve">Your account has now been forwarded to the </w:t>
+      </w:r>
+      <w:r>
+        <w:rPr>
+          <w:b/>
+          <w:bCs/>
+        </w:rPr>
+        <w:t>Office of Debt Litigation &amp; Arbitration</w:t>
+      </w:r>
+      <w:r>
+        <w:t xml:space="preserve">, and </w:t>
+      </w:r>
+      <w:r>
+        <w:rPr>
+          <w:b/>
+          <w:bCs/>
+        </w:rPr>
+        <w:t>your file has been tagged for immediate court action</w:t>
+      </w:r>
+      <w:r>
+        <w:t>. You are being held liable under the following legal statutes:</w:t>
+      </w:r>
+    </w:p>
+    <w:p>
+      <w:pPr>
+        <w:numPr>
+          <w:ilvl w:val="0"/>
+          <w:numId w:val="1"/>
+        </w:numPr>
+      </w:pPr>
+      <w:r>
+        <w:rPr>
+          <w:b/>
+          <w:bCs/>
+        </w:rPr>
+        <w:t>Breach of Loan Agreement (U.S. Code 15 § 1</w:t>
+      </w:r>
+      <w:r>
+        <w:rPr>
+          <w:b/>
+          <w:bCs/>
+        </w:rPr>
+        <w:t>5</w:t>
+      </w:r>
+      <w:r>
+        <w:rPr>
+          <w:b/>
+          <w:bCs/>
+        </w:rPr>
+        <w:t>92)</w:t>
+      </w:r>
+    </w:p>
+    <w:p>
+      <w:pPr>
+        <w:numPr>
+          <w:ilvl w:val="0"/>
+          <w:numId w:val="1"/>
+        </w:numPr>
+      </w:pPr>
+      <w:r>
+        <w:rPr>
+          <w:b/>
+          <w:bCs/>
+        </w:rPr>
+        <w:t>Intentional Check Fraud</w:t>
+      </w:r>
+    </w:p>
+    <w:p>
+      <w:pPr>
+        <w:numPr>
+          <w:ilvl w:val="0"/>
+          <w:numId w:val="1"/>
+        </w:numPr>
+      </w:pPr>
+      <w:r>
+        <w:rPr>
+          <w:b/>
+          <w:bCs/>
+        </w:rPr>
+        <w:t>Misrepresentation and Deceptive Conduct</w:t>
+      </w:r>
+    </w:p>
+    <w:p>
+      <w:pPr>
+        <w:numPr>
+          <w:ilvl w:val="0"/>
+          <w:numId w:val="1"/>
+        </w:numPr>
+      </w:pPr>
+      <w:r>
+        <w:rPr>
+          <w:b/>
+          <w:bCs/>
+        </w:rPr>
+        <w:t>Deliberate Default and Negligent Liability</w:t>
+      </w:r>
+    </w:p>
+    <w:p>
+      <w:pPr>
+        <w:rPr>
+          <w:b/>
+          <w:bCs/>
+        </w:rPr>
+      </w:pPr>
+      <w:r>
+        <w:rPr>
+          <w:b/>
+          <w:bCs/>
+        </w:rPr>
+        <w:t>Settlement Opportunity (Deadline: 72 Hours from Receipt of Notice):</w:t>
+      </w:r>
+    </w:p>
+    <w:p>
+      <w:pPr>
+        <w:rPr>
+          <w:b/>
+          <w:bCs/>
+        </w:rPr>
+      </w:pPr>
+    </w:p>
+    <w:p>
+      <w:pPr>
+        <w:pStyle w:val="ListParagraph"/>
+        <w:numPr>
+          <w:ilvl w:val="0"/>
+          <w:numId w:val="4"/>
+        </w:numPr>
+      </w:pPr>
+      <w:r>
+        <w:rPr>
+          <w:b/>
+          <w:bCs/>
+        </w:rPr>
+        <w:t>Option 1-</w:t>
+      </w:r>
+      <w:r>
+        <w:rPr>
+          <w:b/>
+          <w:bCs/>
+        </w:rPr>
+        <w:t xml:space="preserve"> </w:t>
+      </w:r>
+      <w:r>
+        <w:t>We</w:t>
+      </w:r>
+      <w:r>
+        <w:t xml:space="preserve"> are offering you a one-time chance to </w:t>
+      </w:r>
+      <w:r>
+        <w:rPr>
+          <w:b/>
+          <w:bCs/>
+        </w:rPr>
+        <w:t xml:space="preserve">settle your outstanding account for </w:t>
+      </w:r>
+      <w:r>
+        <w:rPr>
+          <w:b/>
+          <w:bCs/>
+        </w:rPr>
+        <w:t>USD</w:t>
+      </w:r>
+      <w:r>
+        <w:rPr>
+          <w:b/>
+          <w:bCs/>
+        </w:rPr>
+        <w:t>1299.75</w:t>
+      </w:r>
+      <w:r>
+        <w:t xml:space="preserve">, which will prevent further legal escalation and immediate filing with the </w:t>
+      </w:r>
+      <w:r>
+        <w:rPr>
+          <w:b/>
+          <w:bCs/>
+        </w:rPr>
+        <w:t>Superior Civil Court</w:t>
+      </w:r>
+      <w:r>
+        <w:t>.</w:t>
+      </w:r>
+    </w:p>
+    <w:p>
+      <w:pPr>
+        <w:pStyle w:val="ListParagraph"/>
+        <w:numPr>
+          <w:ilvl w:val="0"/>
+          <w:numId w:val="4"/>
+        </w:numPr>
+      </w:pPr>
+      <w:r>
+        <w:rPr>
+          <w:b/>
+          <w:bCs/>
+        </w:rPr>
+        <w:t>Option 2</w:t>
+      </w:r>
+      <w:r>
+        <w:rPr>
+          <w:b/>
+          <w:bCs/>
+        </w:rPr>
+        <w:t>-</w:t>
+      </w:r>
+      <w:r>
+        <w:rPr>
+          <w:b/>
+          <w:bCs/>
+        </w:rPr>
+        <w:t xml:space="preserve"> Installment Resolution Plan:</w:t>
+      </w:r>
+      <w:r>
+        <w:br/>
+        <w:t xml:space="preserve">Pay </w:t>
+      </w:r>
+      <w:r>
+        <w:rPr>
+          <w:b/>
+          <w:bCs/>
+        </w:rPr>
+        <w:t>USD</w:t>
+      </w:r>
+      <w:r>
+        <w:rPr>
+          <w:b/>
+          <w:bCs/>
+        </w:rPr>
+        <w:t>3</w:t>
+      </w:r>
+      <w:r>
+        <w:rPr>
+          <w:b/>
+          <w:bCs/>
+        </w:rPr>
+        <w:t>0</w:t>
+      </w:r>
+      <w:r>
+        <w:rPr>
+          <w:b/>
+          <w:bCs/>
+        </w:rPr>
+        <w:t>0.00 today</w:t>
+      </w:r>
+      <w:r>
+        <w:t xml:space="preserve"> as a goodwill token. The remaining balance is to be paid for </w:t>
+      </w:r>
+      <w:r>
+        <w:rPr>
+          <w:b/>
+          <w:bCs/>
+        </w:rPr>
+        <w:t>USD</w:t>
+      </w:r>
+      <w:r>
+        <w:rPr>
+          <w:b/>
+          <w:bCs/>
+        </w:rPr>
+        <w:t>3</w:t>
+      </w:r>
+      <w:r>
+        <w:rPr>
+          <w:b/>
+          <w:bCs/>
+        </w:rPr>
+        <w:t>0</w:t>
+      </w:r>
+      <w:r>
+        <w:rPr>
+          <w:b/>
+          <w:bCs/>
+        </w:rPr>
+        <w:t>0.00 weekly installments</w:t>
+      </w:r>
+      <w:r>
+        <w:t xml:space="preserve"> until the full debt is cleared. This will </w:t>
+      </w:r>
+      <w:r>
+        <w:rPr>
+          <w:b/>
+          <w:bCs/>
+        </w:rPr>
+        <w:t>temporarily pause</w:t>
+      </w:r>
+      <w:r>
+        <w:t xml:space="preserve"> legal action for 14 days.</w:t>
+      </w:r>
+    </w:p>
+    <w:p/>
+    <w:p>
+      <w:r>
+        <w:t>To activate the settlement:</w:t>
+      </w:r>
+    </w:p>
+    <w:p>
       <w:pPr>
         <w:numPr>
           <w:ilvl w:val="0"/>
           <w:numId w:val="2"/>
         </w:numPr>
-      </w:pPr>
-      <w:r>
-        <w:t xml:space="preserve">Include your </w:t>
-      </w:r>
-      <w:r>
-        <w:rPr>
-          <w:b/>
-          <w:bCs/>
-        </w:rPr>
-        <w:t>CASE NUMBER: DCL-0923-AGV-45</w:t>
-      </w:r>
-      <w:r>
-        <w:rPr>
-          <w:b/>
-          <w:bCs/>
-        </w:rPr>
-        <w:t>96</w:t>
-      </w:r>
+        <w:rPr>
+          <w:b/>
+          <w:bCs/>
+        </w:rPr>
+      </w:pPr>
+      <w:r>
+        <w:t xml:space="preserve">Email our office at </w:t>
+      </w:r>
+      <w:r>
+        <w:t xml:space="preserve"> </w:t>
+      </w:r>
+      <w:hyperlink r:id="rId6" w:history="1">
+        <w:r>
+          <w:rPr>
+            <w:rStyle w:val="Hyperlink"/>
+            <w:b/>
+            <w:bCs/>
+            <w:sz w:val="28"/>
+            <w:szCs w:val="28"/>
+          </w:rPr>
+          <w:t>ashleycolledebtcollector@gmail.com</w:t>
+        </w:r>
+      </w:hyperlink>
     </w:p>
     <w:p>
       <w:pPr>
@@ -444,6 +445,31 @@
         </w:numPr>
       </w:pPr>
       <w:r>
+        <w:t xml:space="preserve">Include your </w:t>
+      </w:r>
+      <w:r>
+        <w:rPr>
+          <w:b/>
+          <w:bCs/>
+        </w:rPr>
+        <w:t>CASE NUMBER: DCL-0923-AGV-45</w:t>
+      </w:r>
+      <w:r>
+        <w:rPr>
+          <w:b/>
+          <w:bCs/>
+        </w:rPr>
+        <w:t>96</w:t>
+      </w:r>
+    </w:p>
+    <w:p>
+      <w:pPr>
+        <w:numPr>
+          <w:ilvl w:val="0"/>
+          <w:numId w:val="2"/>
+        </w:numPr>
+      </w:pPr>
+      <w:r>
         <w:t>Indicate your preferred payment method (</w:t>
       </w:r>
       <w:r>
@@ -461,6 +487,7 @@
     </w:p>
     <w:p>
       <w:r>
+        <w:lastRenderedPageBreak/>
         <w:t>Failure to respond within the stipulated time frame will result in:</w:t>
       </w:r>
     </w:p>
@@ -494,7 +521,6 @@
           <w:b/>
           <w:bCs/>
         </w:rPr>
-        <w:lastRenderedPageBreak/>
         <w:t>Employer contact and wage deduction processing</w:t>
       </w:r>
     </w:p>

</xml_diff>